<commit_message>
Reemplaza guiones largos en README e instrucciones
</commit_message>
<xml_diff>
--- a/docs/instrucciones_nback.docx
+++ b/docs/instrucciones_nback.docx
@@ -690,7 +690,7 @@
                 <w:color w:val="000000"/>
                 <w:sz w:val="21"/>
               </w:rPr>
-              <w:t>—</w:t>
+              <w:t>-</w:t>
             </w:r>
           </w:p>
         </w:tc>
@@ -717,7 +717,7 @@
                 <w:color w:val="000000"/>
                 <w:sz w:val="21"/>
               </w:rPr>
-              <w:t>—</w:t>
+              <w:t>-</w:t>
             </w:r>
           </w:p>
         </w:tc>
@@ -1292,7 +1292,7 @@
                 <w:color w:val="000000"/>
                 <w:sz w:val="21"/>
               </w:rPr>
-              <w:t>—</w:t>
+              <w:t>-</w:t>
             </w:r>
           </w:p>
         </w:tc>
@@ -1319,7 +1319,7 @@
                 <w:color w:val="000000"/>
                 <w:sz w:val="21"/>
               </w:rPr>
-              <w:t>—</w:t>
+              <w:t>-</w:t>
             </w:r>
           </w:p>
         </w:tc>

</xml_diff>